<commit_message>
macOS fixes + live web dashboard
- Fix battery sampling on psutil 7.x (sentinel secsleft) - exposed on real
  laptops with batteries; regression tests cover all psutil battery shapes
- New: arc web - zero-dependency live dashboard (gauges, contract states,
  managed processes before/after, streaming event feed) for demos
- demo/generate_load.sh - CPU load generator to trigger contracts live
- 4 battery regression tests (27 total passing)
- README: PEP 668 venv quickstart for macOS/Homebrew
- PPT: 'Results at a Glance' KPI slide + dashboard demo flow
</commit_message>
<xml_diff>
--- a/docs/ARC_Final_Report.docx
+++ b/docs/ARC_Final_Report.docx
@@ -566,7 +566,15 @@
         <w:pStyle w:val="ListBullet"/>
       </w:pPr>
       <w:r>
-        <w:t>logger.py and cli.py - JSONL plus human-readable execution logs, and a command-line interface (validate, run, simulate, selftest, status).</w:t>
+        <w:t>logger.py and cli.py - JSONL plus human-readable execution logs, and a command-line interface (validate, run, simulate, selftest, status, web).</w:t>
+      </w:r>
+    </w:p>
+    <w:p>
+      <w:pPr>
+        <w:pStyle w:val="ListBullet"/>
+      </w:pPr>
+      <w:r>
+        <w:t>web.py - a zero-dependency live dashboard (arc web) showing CPU/memory/battery gauges, contract lifecycle states, managed processes with before/after resource state, and a streaming event feed, used for real-time demonstration of policy decisions.</w:t>
       </w:r>
     </w:p>
     <w:p>

</xml_diff>

<commit_message>
Terminal dashboard + closed-loop gap figure
- arc dashboard (rich): full-screen terminal UI - system gauges, contract
  lifecycle badges (IDLE/PENDING/ACTIVE/RESTORING), live event feed,
  CPU sparkline + event-marker history; plain-text fallback without rich
- TRIGGER_OFF now logged when a trigger clears (full lifecycle visibility)
- fig_gap.png: comparison table + closed policy loop (monitor->detect->
  decide->enforce->restore) with existing tools on individual arcs
- PPT: new 'The Gap: Nobody Closes the Loop' slide (19 slides total)
- Report: gap figure as Figure 1 in Literature Survey (figures renumbered)
- DEMO_GUIDE/README updated: dashboard is the demo centerpiece
- 40 tests passing (4 new dashboard/lifecycle tests)
</commit_message>
<xml_diff>
--- a/docs/ARC_Final_Report.docx
+++ b/docs/ARC_Final_Report.docx
@@ -236,7 +236,58 @@
           <w:i w:val="0"/>
           <w:sz w:val="22"/>
         </w:rPr>
-        <w:t>Limitations and research gap. The technical building blocks for adaptive resource management already exist, and several tools demonstrate partial automation. However, monitoring and enforcement remain separate, policies are predominantly static, and no lightweight abstraction connects runtime conditions, resource actions, and restoration behavior within a single user-defined contract. ARC investigates exactly this gap: a policy layer that coordinates existing mechanisms rather than replacing them.</w:t>
+        <w:t>Limitations and research gap. The technical building blocks for adaptive resource management already exist, and several tools demonstrate partial automation. However, monitoring and enforcement remain separate, policies are predominantly static, and no lightweight abstraction connects runtime conditions, resource actions, and restoration behavior within a single user-defined contract. In short, existing tools each cover one slice of the policy cycle, while none of them closes the monitor-detect-decide-enforce-restore loop as a single user-defined unit (Figure 1). ARC investigates exactly this gap: a policy layer that coordinates existing mechanisms rather than replacing them.</w:t>
+      </w:r>
+    </w:p>
+    <w:p>
+      <w:pPr>
+        <w:jc w:val="center"/>
+      </w:pPr>
+      <w:r>
+        <w:drawing>
+          <wp:inline xmlns:a="http://schemas.openxmlformats.org/drawingml/2006/main" xmlns:pic="http://schemas.openxmlformats.org/drawingml/2006/picture">
+            <wp:extent cx="5486400" cy="2355336"/>
+            <wp:docPr id="1" name="Picture 1"/>
+            <wp:cNvGraphicFramePr>
+              <a:graphicFrameLocks noChangeAspect="1"/>
+            </wp:cNvGraphicFramePr>
+            <a:graphic>
+              <a:graphicData uri="http://schemas.openxmlformats.org/drawingml/2006/picture">
+                <pic:pic>
+                  <pic:nvPicPr>
+                    <pic:cNvPr id="0" name="fig_gap.png"/>
+                    <pic:cNvPicPr/>
+                  </pic:nvPicPr>
+                  <pic:blipFill>
+                    <a:blip r:embed="rId9"/>
+                    <a:stretch>
+                      <a:fillRect/>
+                    </a:stretch>
+                  </pic:blipFill>
+                  <pic:spPr>
+                    <a:xfrm>
+                      <a:off x="0" y="0"/>
+                      <a:ext cx="5486400" cy="2355336"/>
+                    </a:xfrm>
+                    <a:prstGeom prst="rect"/>
+                  </pic:spPr>
+                </pic:pic>
+              </a:graphicData>
+            </a:graphic>
+          </wp:inline>
+        </w:drawing>
+      </w:r>
+    </w:p>
+    <w:p>
+      <w:pPr>
+        <w:jc w:val="center"/>
+      </w:pPr>
+      <w:r>
+        <w:rPr>
+          <w:i/>
+          <w:sz w:val="18"/>
+        </w:rPr>
+        <w:t>Figure 1: The research gap. Manual scripts and existing automation tools each cover a slice of the policy cycle; an ARC contract spans the complete closed loop.</w:t>
       </w:r>
     </w:p>
     <w:p>
@@ -329,7 +380,7 @@
         <w:drawing>
           <wp:inline xmlns:a="http://schemas.openxmlformats.org/drawingml/2006/main" xmlns:pic="http://schemas.openxmlformats.org/drawingml/2006/picture">
             <wp:extent cx="5486400" cy="2741445"/>
-            <wp:docPr id="1" name="Picture 1"/>
+            <wp:docPr id="2" name="Picture 2"/>
             <wp:cNvGraphicFramePr>
               <a:graphicFrameLocks noChangeAspect="1"/>
             </wp:cNvGraphicFramePr>
@@ -341,7 +392,7 @@
                     <pic:cNvPicPr/>
                   </pic:nvPicPr>
                   <pic:blipFill>
-                    <a:blip r:embed="rId9"/>
+                    <a:blip r:embed="rId10"/>
                     <a:stretch>
                       <a:fillRect/>
                     </a:stretch>
@@ -369,7 +420,7 @@
           <w:i/>
           <w:sz w:val="18"/>
         </w:rPr>
-        <w:t>Figure 1: ARC architecture. Monitoring feeds event detection; the contract engine decides; the executor enforces through existing OS interfaces; snapshots enable restoration.</w:t>
+        <w:t>Figure 2: ARC architecture. Monitoring feeds event detection; the contract engine decides; the executor enforces through existing OS interfaces; snapshots enable restoration.</w:t>
       </w:r>
     </w:p>
     <w:p>
@@ -416,7 +467,7 @@
         <w:drawing>
           <wp:inline xmlns:a="http://schemas.openxmlformats.org/drawingml/2006/main" xmlns:pic="http://schemas.openxmlformats.org/drawingml/2006/picture">
             <wp:extent cx="5486400" cy="2041451"/>
-            <wp:docPr id="2" name="Picture 2"/>
+            <wp:docPr id="3" name="Picture 3"/>
             <wp:cNvGraphicFramePr>
               <a:graphicFrameLocks noChangeAspect="1"/>
             </wp:cNvGraphicFramePr>
@@ -428,7 +479,7 @@
                     <pic:cNvPicPr/>
                   </pic:nvPicPr>
                   <pic:blipFill>
-                    <a:blip r:embed="rId10"/>
+                    <a:blip r:embed="rId11"/>
                     <a:stretch>
                       <a:fillRect/>
                     </a:stretch>
@@ -456,7 +507,7 @@
           <w:i/>
           <w:sz w:val="18"/>
         </w:rPr>
-        <w:t>Figure 2: Per-contract lifecycle. Restoration returns the system to its pre-contract state.</w:t>
+        <w:t>Figure 3: Per-contract lifecycle. Restoration returns the system to its pre-contract state.</w:t>
       </w:r>
     </w:p>
     <w:p>
@@ -1170,7 +1221,7 @@
         <w:drawing>
           <wp:inline xmlns:a="http://schemas.openxmlformats.org/drawingml/2006/main" xmlns:pic="http://schemas.openxmlformats.org/drawingml/2006/picture">
             <wp:extent cx="5486400" cy="2779776"/>
-            <wp:docPr id="3" name="Picture 3"/>
+            <wp:docPr id="4" name="Picture 4"/>
             <wp:cNvGraphicFramePr>
               <a:graphicFrameLocks noChangeAspect="1"/>
             </wp:cNvGraphicFramePr>
@@ -1182,7 +1233,7 @@
                     <pic:cNvPicPr/>
                   </pic:nvPicPr>
                   <pic:blipFill>
-                    <a:blip r:embed="rId11"/>
+                    <a:blip r:embed="rId12"/>
                     <a:stretch>
                       <a:fillRect/>
                     </a:stretch>
@@ -1210,7 +1261,7 @@
           <w:i/>
           <w:sz w:val="18"/>
         </w:rPr>
-        <w:t>Figure 3: Detection latency versus sampling interval and debounce (mean ± stdev).</w:t>
+        <w:t>Figure 4: Detection latency versus sampling interval and debounce (mean ± stdev).</w:t>
       </w:r>
     </w:p>
     <w:p>
@@ -1473,7 +1524,7 @@
         <w:drawing>
           <wp:inline xmlns:a="http://schemas.openxmlformats.org/drawingml/2006/main" xmlns:pic="http://schemas.openxmlformats.org/drawingml/2006/picture">
             <wp:extent cx="5486400" cy="3291840"/>
-            <wp:docPr id="4" name="Picture 4"/>
+            <wp:docPr id="5" name="Picture 5"/>
             <wp:cNvGraphicFramePr>
               <a:graphicFrameLocks noChangeAspect="1"/>
             </wp:cNvGraphicFramePr>
@@ -1485,7 +1536,7 @@
                     <pic:cNvPicPr/>
                   </pic:nvPicPr>
                   <pic:blipFill>
-                    <a:blip r:embed="rId12"/>
+                    <a:blip r:embed="rId13"/>
                     <a:stretch>
                       <a:fillRect/>
                     </a:stretch>
@@ -1513,7 +1564,7 @@
           <w:i/>
           <w:sz w:val="18"/>
         </w:rPr>
-        <w:t>Figure 4: ARC CPU overhead versus sampling interval (20 background processes).</w:t>
+        <w:t>Figure 5: ARC CPU overhead versus sampling interval (20 background processes).</w:t>
       </w:r>
     </w:p>
     <w:p>
@@ -1724,7 +1775,7 @@
         <w:drawing>
           <wp:inline xmlns:a="http://schemas.openxmlformats.org/drawingml/2006/main" xmlns:pic="http://schemas.openxmlformats.org/drawingml/2006/picture">
             <wp:extent cx="5486400" cy="3207434"/>
-            <wp:docPr id="5" name="Picture 5"/>
+            <wp:docPr id="6" name="Picture 6"/>
             <wp:cNvGraphicFramePr>
               <a:graphicFrameLocks noChangeAspect="1"/>
             </wp:cNvGraphicFramePr>
@@ -1736,7 +1787,7 @@
                     <pic:cNvPicPr/>
                   </pic:nvPicPr>
                   <pic:blipFill>
-                    <a:blip r:embed="rId13"/>
+                    <a:blip r:embed="rId14"/>
                     <a:stretch>
                       <a:fillRect/>
                     </a:stretch>
@@ -1764,7 +1815,7 @@
           <w:i/>
           <w:sz w:val="18"/>
         </w:rPr>
-        <w:t>Figure 5: Worker CPU share under contention for different contract-enforced priority levels.</w:t>
+        <w:t>Figure 6: Worker CPU share under contention for different contract-enforced priority levels.</w:t>
       </w:r>
     </w:p>
     <w:p>
@@ -1782,7 +1833,7 @@
           <w:i w:val="0"/>
           <w:sz w:val="22"/>
         </w:rPr>
-        <w:t>A full live contract was exercised with real processes and real actions: when a compiler process appeared, its priority was raised and a background workload was deprioritized; when the compiler exited, all changes were reverted. Trigger-to-first-action latency was 304.3 ms at the 0.2 s sampling interval, and the background workload's nice value returned exactly to its original value (restore exact: True). Figure 6 shows the observed lifecycle timeline.</w:t>
+        <w:t>A full live contract was exercised with real processes and real actions: when a compiler process appeared, its priority was raised and a background workload was deprioritized; when the compiler exited, all changes were reverted. Trigger-to-first-action latency was 304.3 ms at the 0.2 s sampling interval, and the background workload's nice value returned exactly to its original value (restore exact: True). Figure 7 shows the observed lifecycle timeline.</w:t>
       </w:r>
     </w:p>
     <w:p>
@@ -1793,7 +1844,7 @@
         <w:drawing>
           <wp:inline xmlns:a="http://schemas.openxmlformats.org/drawingml/2006/main" xmlns:pic="http://schemas.openxmlformats.org/drawingml/2006/picture">
             <wp:extent cx="5486400" cy="2194560"/>
-            <wp:docPr id="6" name="Picture 6"/>
+            <wp:docPr id="7" name="Picture 7"/>
             <wp:cNvGraphicFramePr>
               <a:graphicFrameLocks noChangeAspect="1"/>
             </wp:cNvGraphicFramePr>
@@ -1805,7 +1856,7 @@
                     <pic:cNvPicPr/>
                   </pic:nvPicPr>
                   <pic:blipFill>
-                    <a:blip r:embed="rId14"/>
+                    <a:blip r:embed="rId15"/>
                     <a:stretch>
                       <a:fillRect/>
                     </a:stretch>
@@ -1833,7 +1884,7 @@
           <w:i/>
           <w:sz w:val="18"/>
         </w:rPr>
-        <w:t>Figure 6: Live contract lifecycle: trigger, enforcement, restoration.</w:t>
+        <w:t>Figure 7: Live contract lifecycle: trigger, enforcement, restoration.</w:t>
       </w:r>
     </w:p>
     <w:p>

</xml_diff>